<commit_message>
docs: replace Foundations of Vibe Coding with Fundamentals of Vibe Coding across all documentation, source code, and submission artifacts
</commit_message>
<xml_diff>
--- a/FINAL_SUBMISSION_FORM.docx
+++ b/FINAL_SUBMISSION_FORM.docx
@@ -12,7 +12,7 @@
           <w:color w:val="1E1B4B"/>
           <w:sz w:val="40"/>
         </w:rPr>
-        <w:t>CSE226 Foundations of Vibe Coding</w:t>
+        <w:t>CSE226 Fundamentals of Vibe Coding</w:t>
         <w:br/>
         <w:t>Final Project Submission Form</w:t>
       </w:r>
@@ -66,7 +66,7 @@
               <w:rPr>
                 <w:sz w:val="20"/>
               </w:rPr>
-              <w:t>CSE226 Foundations of Vibe Coding</w:t>
+              <w:t>CSE226 Fundamentals of Vibe Coding</w:t>
             </w:r>
           </w:p>
         </w:tc>

</xml_diff>